<commit_message>
feat(core): implement WhatsApp 24h reminders, multi-appointment modal view, and 1-click admin actions
</commit_message>
<xml_diff>
--- a/Contratos/contrato_prestacion_servicios_saas.docx
+++ b/Contratos/contrato_prestacion_servicios_saas.docx
@@ -328,6 +328,190 @@
         </w:rPr>
         <w:t>:</w:t>
       </w:r>
+    </w:p>
+    <w:p>
+      <w:pPr>
+        <w:pStyle w:val="Prrafodelista"/>
+        <w:numPr>
+          <w:ilvl w:val="0"/>
+          <w:numId w:val="13"/>
+        </w:numPr>
+        <w:spacing w:before="100" w:beforeAutospacing="1" w:after="100" w:afterAutospacing="1" w:line="240" w:lineRule="auto"/>
+        <w:jc w:val="both"/>
+        <w:rPr>
+          <w:rFonts w:ascii="Times New Roman" w:eastAsia="Times New Roman" w:hAnsi="Times New Roman" w:cs="Times New Roman"/>
+          <w:sz w:val="24"/>
+          <w:szCs w:val="24"/>
+          <w:lang w:val="es-CO" w:eastAsia="es-CO"/>
+        </w:rPr>
+      </w:pPr>
+      <w:bookmarkStart w:id="1" w:name="_Hlk241225525"/>
+      <w:r>
+        <w:rPr>
+          <w:rFonts w:ascii="Times New Roman" w:eastAsia="Times New Roman" w:hAnsi="Times New Roman" w:cs="Times New Roman"/>
+          <w:b/>
+          <w:bCs/>
+          <w:sz w:val="24"/>
+          <w:szCs w:val="24"/>
+          <w:lang w:val="es-CO" w:eastAsia="es-CO"/>
+        </w:rPr>
+        <w:t>Forma de Pago:</w:t>
+      </w:r>
+      <w:r>
+        <w:rPr>
+          <w:rFonts w:ascii="Times New Roman" w:eastAsia="Times New Roman" w:hAnsi="Times New Roman" w:cs="Times New Roman"/>
+          <w:sz w:val="24"/>
+          <w:szCs w:val="24"/>
+          <w:lang w:val="es-CO" w:eastAsia="es-CO"/>
+        </w:rPr>
+        <w:t xml:space="preserve"> Los pagos deberán realizarse mediante transferencia bancaria a cualquiera de las siguientes cuentas designadas por EL PROVEEDOR:</w:t>
+      </w:r>
+    </w:p>
+    <w:p>
+      <w:pPr>
+        <w:pStyle w:val="Prrafodelista"/>
+        <w:spacing w:before="100" w:beforeAutospacing="1" w:after="100" w:afterAutospacing="1" w:line="240" w:lineRule="auto"/>
+        <w:rPr>
+          <w:rFonts w:ascii="Times New Roman" w:eastAsia="Times New Roman" w:hAnsi="Times New Roman" w:cs="Times New Roman"/>
+          <w:sz w:val="24"/>
+          <w:szCs w:val="24"/>
+          <w:lang w:val="es-CO" w:eastAsia="es-CO"/>
+        </w:rPr>
+      </w:pPr>
+    </w:p>
+    <w:p>
+      <w:pPr>
+        <w:pStyle w:val="Prrafodelista"/>
+        <w:numPr>
+          <w:ilvl w:val="1"/>
+          <w:numId w:val="13"/>
+        </w:numPr>
+        <w:spacing w:after="0" w:line="240" w:lineRule="auto"/>
+        <w:rPr>
+          <w:rFonts w:ascii="Times New Roman" w:eastAsia="Times New Roman" w:hAnsi="Times New Roman" w:cs="Times New Roman"/>
+          <w:sz w:val="24"/>
+          <w:szCs w:val="24"/>
+          <w:lang w:val="es-CO" w:eastAsia="es-CO"/>
+        </w:rPr>
+      </w:pPr>
+      <w:proofErr w:type="spellStart"/>
+      <w:r>
+        <w:rPr>
+          <w:rFonts w:ascii="Times New Roman" w:eastAsia="Times New Roman" w:hAnsi="Times New Roman" w:cs="Times New Roman"/>
+          <w:b/>
+          <w:bCs/>
+          <w:sz w:val="24"/>
+          <w:szCs w:val="24"/>
+          <w:lang w:val="es-CO" w:eastAsia="es-CO"/>
+        </w:rPr>
+        <w:t>Nequi</w:t>
+      </w:r>
+      <w:proofErr w:type="spellEnd"/>
+      <w:r>
+        <w:rPr>
+          <w:rFonts w:ascii="Times New Roman" w:eastAsia="Times New Roman" w:hAnsi="Times New Roman" w:cs="Times New Roman"/>
+          <w:b/>
+          <w:bCs/>
+          <w:sz w:val="24"/>
+          <w:szCs w:val="24"/>
+          <w:lang w:val="es-CO" w:eastAsia="es-CO"/>
+        </w:rPr>
+        <w:t>:</w:t>
+      </w:r>
+      <w:r>
+        <w:rPr>
+          <w:rFonts w:ascii="Times New Roman" w:eastAsia="Times New Roman" w:hAnsi="Times New Roman" w:cs="Times New Roman"/>
+          <w:sz w:val="24"/>
+          <w:szCs w:val="24"/>
+          <w:lang w:val="es-CO" w:eastAsia="es-CO"/>
+        </w:rPr>
+        <w:t xml:space="preserve"> 310 608 0402 </w:t>
+      </w:r>
+    </w:p>
+    <w:p>
+      <w:pPr>
+        <w:pStyle w:val="Prrafodelista"/>
+        <w:numPr>
+          <w:ilvl w:val="1"/>
+          <w:numId w:val="13"/>
+        </w:numPr>
+        <w:spacing w:after="0" w:line="240" w:lineRule="auto"/>
+        <w:rPr>
+          <w:rFonts w:ascii="Times New Roman" w:eastAsia="Times New Roman" w:hAnsi="Times New Roman" w:cs="Times New Roman"/>
+          <w:sz w:val="24"/>
+          <w:szCs w:val="24"/>
+          <w:lang w:val="es-CO" w:eastAsia="es-CO"/>
+        </w:rPr>
+      </w:pPr>
+      <w:r>
+        <w:rPr>
+          <w:rFonts w:ascii="Times New Roman" w:eastAsia="Times New Roman" w:hAnsi="Times New Roman" w:cs="Times New Roman"/>
+          <w:b/>
+          <w:bCs/>
+          <w:sz w:val="24"/>
+          <w:szCs w:val="24"/>
+          <w:lang w:val="es-CO" w:eastAsia="es-CO"/>
+        </w:rPr>
+        <w:t>Cuenta de ahorros Bancolombia:</w:t>
+      </w:r>
+      <w:r>
+        <w:rPr>
+          <w:rFonts w:ascii="Times New Roman" w:eastAsia="Times New Roman" w:hAnsi="Times New Roman" w:cs="Times New Roman"/>
+          <w:sz w:val="24"/>
+          <w:szCs w:val="24"/>
+          <w:lang w:val="es-CO" w:eastAsia="es-CO"/>
+        </w:rPr>
+        <w:t xml:space="preserve"> 17795580514</w:t>
+      </w:r>
+    </w:p>
+    <w:p>
+      <w:pPr>
+        <w:pStyle w:val="Prrafodelista"/>
+        <w:numPr>
+          <w:ilvl w:val="1"/>
+          <w:numId w:val="13"/>
+        </w:numPr>
+        <w:spacing w:after="0" w:line="240" w:lineRule="auto"/>
+        <w:rPr>
+          <w:rFonts w:ascii="Times New Roman" w:eastAsia="Times New Roman" w:hAnsi="Times New Roman" w:cs="Times New Roman"/>
+          <w:sz w:val="24"/>
+          <w:szCs w:val="24"/>
+          <w:lang w:val="es-CO" w:eastAsia="es-CO"/>
+        </w:rPr>
+      </w:pPr>
+      <w:r>
+        <w:rPr>
+          <w:rFonts w:ascii="Times New Roman" w:eastAsia="Times New Roman" w:hAnsi="Times New Roman" w:cs="Times New Roman"/>
+          <w:b/>
+          <w:bCs/>
+          <w:sz w:val="24"/>
+          <w:szCs w:val="24"/>
+          <w:lang w:val="es-CO" w:eastAsia="es-CO"/>
+        </w:rPr>
+        <w:t>Llave:</w:t>
+      </w:r>
+      <w:r>
+        <w:rPr>
+          <w:rFonts w:ascii="Times New Roman" w:eastAsia="Times New Roman" w:hAnsi="Times New Roman" w:cs="Times New Roman"/>
+          <w:sz w:val="24"/>
+          <w:szCs w:val="24"/>
+          <w:lang w:val="es-CO" w:eastAsia="es-CO"/>
+        </w:rPr>
+        <w:t xml:space="preserve"> @3106080402</w:t>
+      </w:r>
+    </w:p>
+    <w:p>
+      <w:pPr>
+        <w:pStyle w:val="Prrafodelista"/>
+        <w:spacing w:after="0" w:line="240" w:lineRule="auto"/>
+        <w:ind w:left="1440"/>
+        <w:rPr>
+          <w:rFonts w:ascii="Times New Roman" w:eastAsia="Times New Roman" w:hAnsi="Times New Roman" w:cs="Times New Roman"/>
+          <w:sz w:val="24"/>
+          <w:szCs w:val="24"/>
+          <w:lang w:val="es-CO" w:eastAsia="es-CO"/>
+        </w:rPr>
+      </w:pPr>
     </w:p>
     <w:p>
       <w:pPr>
@@ -342,7 +526,6 @@
           <w:lang w:val="es-CO"/>
         </w:rPr>
       </w:pPr>
-      <w:bookmarkStart w:id="1" w:name="_Hlk241225525"/>
       <w:proofErr w:type="spellStart"/>
       <w:r>
         <w:rPr>
@@ -457,7 +640,16 @@
           <w:bCs/>
           <w:lang w:val="es-CO"/>
         </w:rPr>
-        <w:t>CIENTO VEINTE MIL PESOS COLOMBIANOS ($120.000 COP / mes)</w:t>
+        <w:t xml:space="preserve">CIENTO VEINTE MIL PESOS </w:t>
+      </w:r>
+      <w:r>
+        <w:rPr>
+          <w:b/>
+          <w:bCs/>
+          <w:lang w:val="es-CO"/>
+        </w:rPr>
+        <w:lastRenderedPageBreak/>
+        <w:t>COLOMBIANOS ($120.000 COP / mes)</w:t>
       </w:r>
       <w:r>
         <w:rPr>
@@ -506,7 +698,6 @@
           <w:bCs/>
           <w:lang w:val="es-CO"/>
         </w:rPr>
-        <w:lastRenderedPageBreak/>
         <w:t>Alcance del Servicio Incluido:</w:t>
       </w:r>
       <w:r>
@@ -1013,7 +1204,14 @@
         <w:rPr>
           <w:lang w:val="es-CO"/>
         </w:rPr>
-        <w:t>EL PROVEEDOR podrá suministrar información, registros, datos, trazabilidad, accesos o cualquier otro contenido relacionado con la cuenta y el uso de la plataforma por parte de EL CLIENTE, cuando dicha información sea requerida por autoridades competentes, judiciales, administrativas o de policía, en cumplimiento de obligaciones legales, órdenes judiciales o requerimientos oficiales conforme a la legislación aplicable.</w:t>
+        <w:t xml:space="preserve">EL PROVEEDOR podrá suministrar información, registros, datos, trazabilidad, accesos o cualquier otro contenido relacionado con la cuenta y el uso de la plataforma por parte de EL CLIENTE, cuando dicha información sea requerida por autoridades competentes, judiciales, administrativas o de </w:t>
+      </w:r>
+      <w:r>
+        <w:rPr>
+          <w:lang w:val="es-CO"/>
+        </w:rPr>
+        <w:lastRenderedPageBreak/>
+        <w:t>policía, en cumplimiento de obligaciones legales, órdenes judiciales o requerimientos oficiales conforme a la legislación aplicable.</w:t>
       </w:r>
     </w:p>
     <w:p>
@@ -1028,7 +1226,6 @@
         <w:rPr>
           <w:lang w:val="es-CO"/>
         </w:rPr>
-        <w:lastRenderedPageBreak/>
         <w:t>EL CLIENTE declara conocer y aceptar que EL PROVEEDOR no será responsable por la entrega de dicha información cuando exista obligación legal o requerimiento formal por parte de las autoridades competentes.</w:t>
       </w:r>
     </w:p>
@@ -1933,6 +2130,155 @@
     </w:lvl>
   </w:abstractNum>
   <w:abstractNum w:abstractNumId="9" w15:restartNumberingAfterBreak="0">
+    <w:nsid w:val="08C801D9"/>
+    <w:multiLevelType w:val="multilevel"/>
+    <w:tmpl w:val="2F9CE438"/>
+    <w:lvl w:ilvl="0">
+      <w:start w:val="1"/>
+      <w:numFmt w:val="bullet"/>
+      <w:lvlText w:val=""/>
+      <w:lvlJc w:val="left"/>
+      <w:pPr>
+        <w:tabs>
+          <w:tab w:val="num" w:pos="720"/>
+        </w:tabs>
+        <w:ind w:left="720" w:hanging="360"/>
+      </w:pPr>
+      <w:rPr>
+        <w:rFonts w:ascii="Symbol" w:hAnsi="Symbol" w:hint="default"/>
+        <w:sz w:val="20"/>
+      </w:rPr>
+    </w:lvl>
+    <w:lvl w:ilvl="1" w:tentative="1">
+      <w:start w:val="1"/>
+      <w:numFmt w:val="bullet"/>
+      <w:lvlText w:val="o"/>
+      <w:lvlJc w:val="left"/>
+      <w:pPr>
+        <w:tabs>
+          <w:tab w:val="num" w:pos="1440"/>
+        </w:tabs>
+        <w:ind w:left="1440" w:hanging="360"/>
+      </w:pPr>
+      <w:rPr>
+        <w:rFonts w:ascii="Courier New" w:hAnsi="Courier New" w:hint="default"/>
+        <w:sz w:val="20"/>
+      </w:rPr>
+    </w:lvl>
+    <w:lvl w:ilvl="2" w:tentative="1">
+      <w:start w:val="1"/>
+      <w:numFmt w:val="bullet"/>
+      <w:lvlText w:val=""/>
+      <w:lvlJc w:val="left"/>
+      <w:pPr>
+        <w:tabs>
+          <w:tab w:val="num" w:pos="2160"/>
+        </w:tabs>
+        <w:ind w:left="2160" w:hanging="360"/>
+      </w:pPr>
+      <w:rPr>
+        <w:rFonts w:ascii="Wingdings" w:hAnsi="Wingdings" w:hint="default"/>
+        <w:sz w:val="20"/>
+      </w:rPr>
+    </w:lvl>
+    <w:lvl w:ilvl="3" w:tentative="1">
+      <w:start w:val="1"/>
+      <w:numFmt w:val="bullet"/>
+      <w:lvlText w:val=""/>
+      <w:lvlJc w:val="left"/>
+      <w:pPr>
+        <w:tabs>
+          <w:tab w:val="num" w:pos="2880"/>
+        </w:tabs>
+        <w:ind w:left="2880" w:hanging="360"/>
+      </w:pPr>
+      <w:rPr>
+        <w:rFonts w:ascii="Wingdings" w:hAnsi="Wingdings" w:hint="default"/>
+        <w:sz w:val="20"/>
+      </w:rPr>
+    </w:lvl>
+    <w:lvl w:ilvl="4" w:tentative="1">
+      <w:start w:val="1"/>
+      <w:numFmt w:val="bullet"/>
+      <w:lvlText w:val=""/>
+      <w:lvlJc w:val="left"/>
+      <w:pPr>
+        <w:tabs>
+          <w:tab w:val="num" w:pos="3600"/>
+        </w:tabs>
+        <w:ind w:left="3600" w:hanging="360"/>
+      </w:pPr>
+      <w:rPr>
+        <w:rFonts w:ascii="Wingdings" w:hAnsi="Wingdings" w:hint="default"/>
+        <w:sz w:val="20"/>
+      </w:rPr>
+    </w:lvl>
+    <w:lvl w:ilvl="5" w:tentative="1">
+      <w:start w:val="1"/>
+      <w:numFmt w:val="bullet"/>
+      <w:lvlText w:val=""/>
+      <w:lvlJc w:val="left"/>
+      <w:pPr>
+        <w:tabs>
+          <w:tab w:val="num" w:pos="4320"/>
+        </w:tabs>
+        <w:ind w:left="4320" w:hanging="360"/>
+      </w:pPr>
+      <w:rPr>
+        <w:rFonts w:ascii="Wingdings" w:hAnsi="Wingdings" w:hint="default"/>
+        <w:sz w:val="20"/>
+      </w:rPr>
+    </w:lvl>
+    <w:lvl w:ilvl="6" w:tentative="1">
+      <w:start w:val="1"/>
+      <w:numFmt w:val="bullet"/>
+      <w:lvlText w:val=""/>
+      <w:lvlJc w:val="left"/>
+      <w:pPr>
+        <w:tabs>
+          <w:tab w:val="num" w:pos="5040"/>
+        </w:tabs>
+        <w:ind w:left="5040" w:hanging="360"/>
+      </w:pPr>
+      <w:rPr>
+        <w:rFonts w:ascii="Wingdings" w:hAnsi="Wingdings" w:hint="default"/>
+        <w:sz w:val="20"/>
+      </w:rPr>
+    </w:lvl>
+    <w:lvl w:ilvl="7" w:tentative="1">
+      <w:start w:val="1"/>
+      <w:numFmt w:val="bullet"/>
+      <w:lvlText w:val=""/>
+      <w:lvlJc w:val="left"/>
+      <w:pPr>
+        <w:tabs>
+          <w:tab w:val="num" w:pos="5760"/>
+        </w:tabs>
+        <w:ind w:left="5760" w:hanging="360"/>
+      </w:pPr>
+      <w:rPr>
+        <w:rFonts w:ascii="Wingdings" w:hAnsi="Wingdings" w:hint="default"/>
+        <w:sz w:val="20"/>
+      </w:rPr>
+    </w:lvl>
+    <w:lvl w:ilvl="8" w:tentative="1">
+      <w:start w:val="1"/>
+      <w:numFmt w:val="bullet"/>
+      <w:lvlText w:val=""/>
+      <w:lvlJc w:val="left"/>
+      <w:pPr>
+        <w:tabs>
+          <w:tab w:val="num" w:pos="6480"/>
+        </w:tabs>
+        <w:ind w:left="6480" w:hanging="360"/>
+      </w:pPr>
+      <w:rPr>
+        <w:rFonts w:ascii="Wingdings" w:hAnsi="Wingdings" w:hint="default"/>
+        <w:sz w:val="20"/>
+      </w:rPr>
+    </w:lvl>
+  </w:abstractNum>
+  <w:abstractNum w:abstractNumId="10" w15:restartNumberingAfterBreak="0">
     <w:nsid w:val="165900C6"/>
     <w:multiLevelType w:val="hybridMultilevel"/>
     <w:tmpl w:val="CDF48FB0"/>
@@ -2018,7 +2364,7 @@
       </w:pPr>
     </w:lvl>
   </w:abstractNum>
-  <w:abstractNum w:abstractNumId="10" w15:restartNumberingAfterBreak="0">
+  <w:abstractNum w:abstractNumId="11" w15:restartNumberingAfterBreak="0">
     <w:nsid w:val="39677661"/>
     <w:multiLevelType w:val="multilevel"/>
     <w:tmpl w:val="4F98D574"/>
@@ -2164,6 +2510,119 @@
       <w:rPr>
         <w:rFonts w:ascii="Symbol" w:hAnsi="Symbol" w:hint="default"/>
         <w:sz w:val="20"/>
+      </w:rPr>
+    </w:lvl>
+  </w:abstractNum>
+  <w:abstractNum w:abstractNumId="12" w15:restartNumberingAfterBreak="0">
+    <w:nsid w:val="41A103D4"/>
+    <w:multiLevelType w:val="hybridMultilevel"/>
+    <w:tmpl w:val="C190562A"/>
+    <w:lvl w:ilvl="0" w:tplc="240A0001">
+      <w:start w:val="1"/>
+      <w:numFmt w:val="bullet"/>
+      <w:lvlText w:val=""/>
+      <w:lvlJc w:val="left"/>
+      <w:pPr>
+        <w:ind w:left="720" w:hanging="360"/>
+      </w:pPr>
+      <w:rPr>
+        <w:rFonts w:ascii="Symbol" w:hAnsi="Symbol" w:hint="default"/>
+      </w:rPr>
+    </w:lvl>
+    <w:lvl w:ilvl="1" w:tplc="240A0003">
+      <w:start w:val="1"/>
+      <w:numFmt w:val="bullet"/>
+      <w:lvlText w:val="o"/>
+      <w:lvlJc w:val="left"/>
+      <w:pPr>
+        <w:ind w:left="1440" w:hanging="360"/>
+      </w:pPr>
+      <w:rPr>
+        <w:rFonts w:ascii="Courier New" w:hAnsi="Courier New" w:cs="Courier New" w:hint="default"/>
+      </w:rPr>
+    </w:lvl>
+    <w:lvl w:ilvl="2" w:tplc="240A0005" w:tentative="1">
+      <w:start w:val="1"/>
+      <w:numFmt w:val="bullet"/>
+      <w:lvlText w:val=""/>
+      <w:lvlJc w:val="left"/>
+      <w:pPr>
+        <w:ind w:left="2160" w:hanging="360"/>
+      </w:pPr>
+      <w:rPr>
+        <w:rFonts w:ascii="Wingdings" w:hAnsi="Wingdings" w:hint="default"/>
+      </w:rPr>
+    </w:lvl>
+    <w:lvl w:ilvl="3" w:tplc="240A0001" w:tentative="1">
+      <w:start w:val="1"/>
+      <w:numFmt w:val="bullet"/>
+      <w:lvlText w:val=""/>
+      <w:lvlJc w:val="left"/>
+      <w:pPr>
+        <w:ind w:left="2880" w:hanging="360"/>
+      </w:pPr>
+      <w:rPr>
+        <w:rFonts w:ascii="Symbol" w:hAnsi="Symbol" w:hint="default"/>
+      </w:rPr>
+    </w:lvl>
+    <w:lvl w:ilvl="4" w:tplc="240A0003" w:tentative="1">
+      <w:start w:val="1"/>
+      <w:numFmt w:val="bullet"/>
+      <w:lvlText w:val="o"/>
+      <w:lvlJc w:val="left"/>
+      <w:pPr>
+        <w:ind w:left="3600" w:hanging="360"/>
+      </w:pPr>
+      <w:rPr>
+        <w:rFonts w:ascii="Courier New" w:hAnsi="Courier New" w:cs="Courier New" w:hint="default"/>
+      </w:rPr>
+    </w:lvl>
+    <w:lvl w:ilvl="5" w:tplc="240A0005" w:tentative="1">
+      <w:start w:val="1"/>
+      <w:numFmt w:val="bullet"/>
+      <w:lvlText w:val=""/>
+      <w:lvlJc w:val="left"/>
+      <w:pPr>
+        <w:ind w:left="4320" w:hanging="360"/>
+      </w:pPr>
+      <w:rPr>
+        <w:rFonts w:ascii="Wingdings" w:hAnsi="Wingdings" w:hint="default"/>
+      </w:rPr>
+    </w:lvl>
+    <w:lvl w:ilvl="6" w:tplc="240A0001" w:tentative="1">
+      <w:start w:val="1"/>
+      <w:numFmt w:val="bullet"/>
+      <w:lvlText w:val=""/>
+      <w:lvlJc w:val="left"/>
+      <w:pPr>
+        <w:ind w:left="5040" w:hanging="360"/>
+      </w:pPr>
+      <w:rPr>
+        <w:rFonts w:ascii="Symbol" w:hAnsi="Symbol" w:hint="default"/>
+      </w:rPr>
+    </w:lvl>
+    <w:lvl w:ilvl="7" w:tplc="240A0003" w:tentative="1">
+      <w:start w:val="1"/>
+      <w:numFmt w:val="bullet"/>
+      <w:lvlText w:val="o"/>
+      <w:lvlJc w:val="left"/>
+      <w:pPr>
+        <w:ind w:left="5760" w:hanging="360"/>
+      </w:pPr>
+      <w:rPr>
+        <w:rFonts w:ascii="Courier New" w:hAnsi="Courier New" w:cs="Courier New" w:hint="default"/>
+      </w:rPr>
+    </w:lvl>
+    <w:lvl w:ilvl="8" w:tplc="240A0005" w:tentative="1">
+      <w:start w:val="1"/>
+      <w:numFmt w:val="bullet"/>
+      <w:lvlText w:val=""/>
+      <w:lvlJc w:val="left"/>
+      <w:pPr>
+        <w:ind w:left="6480" w:hanging="360"/>
+      </w:pPr>
+      <w:rPr>
+        <w:rFonts w:ascii="Wingdings" w:hAnsi="Wingdings" w:hint="default"/>
       </w:rPr>
     </w:lvl>
   </w:abstractNum>
@@ -2195,10 +2654,16 @@
     <w:abstractNumId w:val="0"/>
   </w:num>
   <w:num w:numId="10" w16cid:durableId="1082801903">
+    <w:abstractNumId w:val="11"/>
+  </w:num>
+  <w:num w:numId="11" w16cid:durableId="1647274605">
     <w:abstractNumId w:val="10"/>
   </w:num>
-  <w:num w:numId="11" w16cid:durableId="1647274605">
+  <w:num w:numId="12" w16cid:durableId="1884247318">
     <w:abstractNumId w:val="9"/>
+  </w:num>
+  <w:num w:numId="13" w16cid:durableId="1829517100">
+    <w:abstractNumId w:val="12"/>
   </w:num>
 </w:numbering>
 </file>
@@ -13663,6 +14128,20 @@
       </w:tcPr>
     </w:tblStylePr>
   </w:style>
+  <w:style w:type="paragraph" w:customStyle="1" w:styleId="pdq2pgselectionanchorcontainer">
+    <w:name w:val="pdq2pg_selectionanchorcontainer"/>
+    <w:basedOn w:val="Normal"/>
+    <w:rsid w:val="00BB2B57"/>
+    <w:pPr>
+      <w:spacing w:before="100" w:beforeAutospacing="1" w:after="100" w:afterAutospacing="1" w:line="240" w:lineRule="auto"/>
+    </w:pPr>
+    <w:rPr>
+      <w:rFonts w:ascii="Times New Roman" w:eastAsia="Times New Roman" w:hAnsi="Times New Roman" w:cs="Times New Roman"/>
+      <w:sz w:val="24"/>
+      <w:szCs w:val="24"/>
+      <w:lang w:val="es-CO" w:eastAsia="es-CO"/>
+    </w:rPr>
+  </w:style>
 </w:styles>
 </file>
 

</xml_diff>